<commit_message>
Fix conditional GAN training (TTUR + 3 generator steps) and make report honest about cGAN fidelity; rebuild Word report
</commit_message>
<xml_diff>
--- a/Set 4/GAN_Assignment_Report.docx
+++ b/Set 4/GAN_Assignment_Report.docx
@@ -38,7 +38,7 @@
           <w:sz w:val="22"/>
           <w:szCs w:val="22"/>
         </w:rPr>
-        <w:t xml:space="preserve">This report accompanies my notebook implementation of generative adversarial networks (GANs). A GAN pits a generator against a discriminator in a minimax game, and at equilibrium the generator's samples become statistically indistinguishable from real data (Goodfellow et al., 2014). Part 1 builds GANs from scratch on synthetic 2D data to make the training dynamics visible; Part 2 applies convolutional and tabular GANs to three real datasets — medical imaging, network-security traffic and hand-drawn sketches. Throughout, the focus is on *why* an architecture suits a dataset and on interpreting the training behaviour and metrics rather than describing them. Part 1 and the image problems use PyTorch, the tabular model TensorFlow/Keras; fixed seeds (TORCH_SEED = 3030, KERAS_SEED = 4040) make every figure reproducible.</w:t>
+        <w:t xml:space="preserve">This report accompanies my notebook implementation of generative adversarial networks (GANs). A GAN pits a generator against a discriminator in a minimax game, and at equilibrium the generator's samples become statistically indistinguishable from real data (Goodfellow et al., 2014). Part 1 builds GANs from scratch on synthetic 2D data to make the training dynamics visible; Part 2 applies convolutional and tabular GANs to three real datasets — medical imaging, network-security traffic and hand-drawn sketches. The focus throughout is on *why* an architecture suits a dataset and on interpreting the metrics, not just describing them. Part 1 and the image problems use PyTorch, the tabular model TensorFlow/Keras; fixed seeds (TORCH_SEED = 3030, KERAS_SEED = 4040) make every figure reproducible.</w:t>
       </w:r>
     </w:p>
     <w:p>
@@ -261,7 +261,7 @@
           <w:sz w:val="22"/>
           <w:szCs w:val="22"/>
         </w:rPr>
-        <w:t xml:space="preserve">Figure 2 shows the generator tracing the spiral's arms rather than collapsing onto a single loop, which would signal mode collapse. Losses stay near equilibrium (D ≈ 1.45, G ≈ 0.66), with a brief excursion to G ≈ 1.1 around step 6000 before settling — a self-correcting wobble, not divergence. The main weakness is that the outermost arm is slightly sparser than the real data, expected since that region carries the least probability mass and gives the weakest learning signal.</w:t>
+        <w:t xml:space="preserve">Figure 2 shows the generator tracing the spiral's arms rather than collapsing onto a single loop, which would signal mode collapse. Losses stay near equilibrium (D ≈ 1.45, G ≈ 0.66), with a brief excursion to G ≈ 1.1 around step 6000 before settling — a self-correcting wobble, not divergence. The main weakness is a slightly sparser outermost arm, expected since that region carries the least probability mass and the weakest learning signal.</w:t>
       </w:r>
     </w:p>
     <w:p>
@@ -360,7 +360,7 @@
           <w:sz w:val="22"/>
           <w:szCs w:val="22"/>
         </w:rPr>
-        <w:t xml:space="preserve">Figure 3 shows the two point clouds are very similar in coverage and shape, and both hold losses near equilibrium throughout (D ≈ 1.37–1.46, G ≈ 0.66–0.76, ending D ≈ 1.46 / G ≈ 0.69 for the modified network). The deeper LeakyReLU model does not destabilise training; its loss trace is marginally smoother. This shows added depth and a leaky activation are safe here, motivating the deeper convolutional variants used in Part 2.</w:t>
+        <w:t xml:space="preserve">Figure 3 shows the two point clouds are very similar in coverage and shape, and both hold losses near equilibrium throughout (D ≈ 1.37–1.46, G ≈ 0.66–0.76, ending D ≈ 1.46 / G ≈ 0.69 for the modified network). The deeper LeakyReLU model does not destabilise training; its loss trace is marginally smoother. This shows depth and a leaky activation are safe here, motivating Part 2's convolutional variants.</w:t>
       </w:r>
     </w:p>
     <w:p>
@@ -655,7 +655,7 @@
           <w:sz w:val="22"/>
           <w:szCs w:val="22"/>
         </w:rPr>
-        <w:t xml:space="preserve"> A discriminator only ever learns "real or fake", never "anatomically correct" — the GAN version of the duck test, where a sample that looks and "quacks" convincingly passes. Nothing stops the generator inventing a bright region or layer boundary no real scan had, provided it is statistically plausible. A good FID only tells us the *aggregate* statistics of a batch are close to real; it says nothing about whether a single image is trustworthy. In a retinal scan a hallucinated bright patch could mimic pathology that is not there, so I would restrict synthetic scans to augmentation or teaching and re-validate any classifier trained on them against real-only data.</w:t>
+        <w:t xml:space="preserve"> A discriminator only ever learns "real or fake", never "anatomically correct" — the GAN version of the duck test, where a sample that looks and "quacks" convincingly passes. Nothing stops the generator inventing a bright region or layer boundary no real scan had, provided it is statistically plausible. A good FID only says the *aggregate* statistics of a batch are close to real, not whether any single image is trustworthy: a hallucinated bright patch could mimic pathology that is not there. I would therefore restrict synthetic scans to augmentation or teaching and re-validate any classifier trained on them against real-only data.</w:t>
       </w:r>
     </w:p>
     <w:p>
@@ -675,7 +675,7 @@
           <w:sz w:val="22"/>
           <w:szCs w:val="22"/>
         </w:rPr>
-        <w:t xml:space="preserve"> The extension conditions the generator on the label by concatenating a learned class embedding with the latent vector, while the discriminator receives the label as an extra channel (Mirza and Osindero, 2014).</w:t>
+        <w:t xml:space="preserve"> The generator concatenates a learned class embedding with the latent vector and the discriminator takes the label as an extra image channel (Mirza and Osindero, 2014). The label channel let the discriminator overpower the generator (loss climbing to 8–12), so a two-time-scale schedule — lower discriminator learning rate and three generator steps per critic step — was needed to rebalance it.</w:t>
       </w:r>
     </w:p>
     <w:p>
@@ -749,7 +749,7 @@
           <w:sz w:val="22"/>
           <w:szCs w:val="22"/>
         </w:rPr>
-        <w:t xml:space="preserve">Figure 7 shows the rows differ visibly, confirming the generator responds to the label rather than ignoring it. As expected from the imbalance in Figure 4, the better-represented classes are most convincing — the standard outcome for a conditional GAN on imbalanced data — and the model now generates a chosen class on demand.</w:t>
+        <w:t xml:space="preserve">Figure 7 produces a class-dependent scan for each requested label, so conditioning is used and classes generate on demand — but fidelity is visibly lower than the unconditional DCGAN, with grainier scans and a less crisp retinal band. That is the expected cost of splitting limited capacity across four imbalanced classes in the harder conditional game, and it is the extension's main limitation and clearest future-work target.</w:t>
       </w:r>
     </w:p>
     <w:p>
@@ -774,7 +774,7 @@
           <w:sz w:val="22"/>
           <w:szCs w:val="22"/>
         </w:rPr>
-        <w:t xml:space="preserve">CICIDS 2017 records each network flow as a numeric feature vector, not an image (Sharafaldin, Lashkari and Ghorbani, 2018). Combining the eight daily files gives 2,830,743 flows and 78 numeric features. With no spatial structure a convolutional model makes no sense; instead I use a fully-connected (dense) GAN as a keras.Model subclass with a custom train_step, latent dimension 64. The generator uses a linear output (the scaled features are unbounded) and the critic returns a single logit.</w:t>
+        <w:t xml:space="preserve">CICIDS 2017 records each network flow as a numeric feature vector, not an image (Sharafaldin, Lashkari and Ghorbani, 2018). Combining the eight daily files gives 2,830,743 flows and 78 numeric features. With no spatial structure, a fully-connected (dense) GAN is used, implemented as a keras.Model subclass with a custom train_step (latent dimension 64); the generator has a linear output since the features are unbounded.</w:t>
       </w:r>
     </w:p>
     <w:p>
@@ -1418,7 +1418,7 @@
           <w:sz w:val="22"/>
           <w:szCs w:val="22"/>
         </w:rPr>
-        <w:t xml:space="preserve">) exactly. The sparsest, most regular category is easiest and the busiest is hardest. The deeper driver is intra-class variety: cat sketches differ far more from one another (pose, ears, whiskers, sitting versus standing) than houses do, and that variety is the harder thing for a fixed-capacity DCGAN to capture — which is why cat stays weakest even after the stronger schedule.</w:t>
+        <w:t xml:space="preserve">) exactly. The sparsest, most regular category is easiest and the busiest is hardest. The deeper driver is intra-class variety: cat sketches differ far more from one another (pose, ears, whiskers) than houses do, which is the harder thing for a fixed-capacity DCGAN to capture and why cat stays weakest even after the stronger schedule.</w:t>
       </w:r>
     </w:p>
     <w:p>
@@ -1443,7 +1443,7 @@
           <w:sz w:val="22"/>
           <w:szCs w:val="22"/>
         </w:rPr>
-        <w:t xml:space="preserve">Across all five experiments the implementations behaved as theory predicts and the metrics tell a consistent story. Part 1 confirmed correctness by landing the sine-wave GAN on its analytic equilibrium and showed a deeper, leaky-activated generator is a safe modification. Part 2 matched architecture to data: a resize-convolution DCGAN for OCT scans (FID 31.94) and QuickDraw sketches (cake 41.01, house 28.76, cat 67.36), and a dense feature-vector GAN for CICIDS traffic (gaps 0.4730/0.5293 on Wednesday). Recurring themes: class imbalance limits how faithfully minority modes are reproduced; FID and alignment gaps measure aggregate fidelity, not individual trustworthiness (the duck test); and intra-class variety predicts difficulty better than surface complexity. For future work I would add a conditional or Wasserstein objective to the tabular model for rare attack families, increase generator capacity for high-variety classes such as cat, and pair FID with a precision–recall metric.</w:t>
+        <w:t xml:space="preserve">Across all five experiments the implementations behaved as expected and the metrics are consistent. Part 1 confirmed correctness by landing the sine-wave GAN on its analytic equilibrium and showed a deeper, leaky-activated generator is a safe modification. Part 2 matched architecture to data: a resize-convolution DCGAN for OCT scans (FID 31.94) and QuickDraw sketches (cake 41.01, house 28.76, cat 67.36), and a dense feature-vector GAN for CICIDS traffic (gaps 0.4730/0.5293 on Wednesday). Recurring themes: class imbalance limits how faithfully minority modes are reproduced; FID and alignment gaps measure aggregate fidelity, not individual trustworthiness (the duck test); and intra-class variety predicts difficulty better than surface complexity. For future work I would add a conditional or Wasserstein objective to the tabular model for rare attack families, increase generator capacity for high-variety classes such as cat, and pair FID with a precision–recall metric.</w:t>
       </w:r>
     </w:p>
     <w:p>

</xml_diff>

<commit_message>
Restore result images (accidentally deleted) and sync report CICIDS numbers to final run
</commit_message>
<xml_diff>
--- a/Set 4/GAN_Assignment_Report.docx
+++ b/Set 4/GAN_Assignment_Report.docx
@@ -1019,7 +1019,7 @@
           <w:sz w:val="22"/>
           <w:szCs w:val="22"/>
         </w:rPr>
-        <w:t xml:space="preserve">0.4730</w:t>
+        <w:t xml:space="preserve">0.4583</w:t>
       </w:r>
       <w:r>
         <w:rPr>
@@ -1034,7 +1034,7 @@
           <w:sz w:val="22"/>
           <w:szCs w:val="22"/>
         </w:rPr>
-        <w:t xml:space="preserve">0.5293</w:t>
+        <w:t xml:space="preserve">0.5373</w:t>
       </w:r>
       <w:r>
         <w:rPr>
@@ -1143,7 +1143,7 @@
           <w:sz w:val="22"/>
           <w:szCs w:val="22"/>
         </w:rPr>
-        <w:t xml:space="preserve">0.5454</w:t>
+        <w:t xml:space="preserve">0.5680</w:t>
       </w:r>
       <w:r>
         <w:rPr>
@@ -1158,7 +1158,7 @@
           <w:sz w:val="22"/>
           <w:szCs w:val="22"/>
         </w:rPr>
-        <w:t xml:space="preserve">0.6094</w:t>
+        <w:t xml:space="preserve">0.6145</w:t>
       </w:r>
       <w:r>
         <w:rPr>
@@ -1443,7 +1443,7 @@
           <w:sz w:val="22"/>
           <w:szCs w:val="22"/>
         </w:rPr>
-        <w:t xml:space="preserve">Across all five experiments the implementations behaved as expected and the metrics are consistent. Part 1 confirmed correctness by landing the sine-wave GAN on its analytic equilibrium and showed a deeper, leaky-activated generator is a safe modification. Part 2 matched architecture to data: a resize-convolution DCGAN for OCT scans (FID 31.94) and QuickDraw sketches (cake 41.01, house 28.76, cat 67.36), and a dense feature-vector GAN for CICIDS traffic (gaps 0.4730/0.5293 on Wednesday). Recurring themes: class imbalance limits how faithfully minority modes are reproduced; FID and alignment gaps measure aggregate fidelity, not individual trustworthiness (the duck test); and intra-class variety predicts difficulty better than surface complexity. For future work I would add a conditional or Wasserstein objective to the tabular model for rare attack families, increase generator capacity for high-variety classes such as cat, and pair FID with a precision–recall metric.</w:t>
+        <w:t xml:space="preserve">Across all five experiments the implementations behaved as expected and the metrics are consistent. Part 1 confirmed correctness by landing the sine-wave GAN on its analytic equilibrium and showed a deeper, leaky-activated generator is a safe modification. Part 2 matched architecture to data: a resize-convolution DCGAN for OCT scans (FID 31.94) and QuickDraw sketches (cake 41.01, house 28.76, cat 67.36), and a dense feature-vector GAN for CICIDS traffic (gaps 0.4583/0.5373 on Wednesday). Recurring themes: class imbalance limits how faithfully minority modes are reproduced; FID and alignment gaps measure aggregate fidelity, not individual trustworthiness (the duck test); and intra-class variety predicts difficulty better than surface complexity. For future work I would add a conditional or Wasserstein objective to the tabular model for rare attack families, increase generator capacity for high-variety classes such as cat, and pair FID with a precision–recall metric.</w:t>
       </w:r>
     </w:p>
     <w:p>

</xml_diff>

<commit_message>
Report: reduce to 12 figures (drop redundant CICIDS t-SNE; keep PCA + alignment gaps), renumber
</commit_message>
<xml_diff>
--- a/Set 4/GAN_Assignment_Report.docx
+++ b/Set 4/GAN_Assignment_Report.docx
@@ -937,7 +937,57 @@
           <w:sz w:val="22"/>
           <w:szCs w:val="22"/>
         </w:rPr>
-        <w:t xml:space="preserve">Figure 9 projects the 78-dimensional vectors to two components. The synthetic points sit within the spread of the real ones rather than forming a separate island — the first sign the generator learned the broad distribution rather than collapsing.</w:t>
+        <w:t xml:space="preserve">Figure 9 projects the 78-dimensional vectors to two principal components. The synthetic points sit within the spread of the real BENIGN and DoS points rather than forming a separate island, showing the generator learned the broad distribution rather than collapsing; a t-SNE projection in the notebook gives a consistent non-linear view (van der Maaten and Hinton, 2008). The per-feature alignment gaps quantify the match: mean absolute differences of </w:t>
+      </w:r>
+      <w:r>
+        <w:rPr>
+          <w:b/>
+          <w:sz w:val="22"/>
+          <w:szCs w:val="22"/>
+        </w:rPr>
+        <w:t xml:space="preserve">0.4583</w:t>
+      </w:r>
+      <w:r>
+        <w:rPr>
+          <w:sz w:val="22"/>
+          <w:szCs w:val="22"/>
+        </w:rPr>
+        <w:t xml:space="preserve"> (means) and </w:t>
+      </w:r>
+      <w:r>
+        <w:rPr>
+          <w:b/>
+          <w:sz w:val="22"/>
+          <w:szCs w:val="22"/>
+        </w:rPr>
+        <w:t xml:space="preserve">0.5373</w:t>
+      </w:r>
+      <w:r>
+        <w:rPr>
+          <w:sz w:val="22"/>
+          <w:szCs w:val="22"/>
+        </w:rPr>
+        <w:t xml:space="preserve"> (standard deviations) — a moderate rather than tight fit, where the generator captures the general shape but under-represents the spread of heavy-tailed or near-binary features such as byte/packet counts and flag columns, the known hard case for tabular GANs.</w:t>
+      </w:r>
+    </w:p>
+    <w:p>
+      <w:pPr>
+        <w:spacing w:before="0" w:after="140"/>
+      </w:pPr>
+      <w:r>
+        <w:rPr>
+          <w:b/>
+          <w:sz w:val="22"/>
+          <w:szCs w:val="22"/>
+        </w:rPr>
+        <w:t xml:space="preserve">Extension — full multi-day dataset.</w:t>
+      </w:r>
+      <w:r>
+        <w:rPr>
+          <w:sz w:val="22"/>
+          <w:szCs w:val="22"/>
+        </w:rPr>
+        <w:t xml:space="preserve"> Retraining on a 30,000-row sample spanning all days tests whether one unconditional generator can cover many attack families.</w:t>
       </w:r>
     </w:p>
     <w:p>
@@ -948,7 +998,7 @@
       <w:r>
         <w:drawing>
           <wp:inline distT="0" distB="0" distL="0" distR="0">
-            <wp:extent cx="5120640" cy="4493959"/>
+            <wp:extent cx="5120640" cy="3998207"/>
             <wp:docPr id="10" name="image10.png"/>
             <a:graphic xmlns:a="http://schemas.openxmlformats.org/drawingml/2006/main">
               <a:graphicData uri="http://schemas.openxmlformats.org/drawingml/2006/picture">
@@ -959,130 +1009,6 @@
                   </pic:nvPicPr>
                   <pic:blipFill>
                     <a:blip r:embed="rId109"/>
-                    <a:stretch>
-                      <a:fillRect/>
-                    </a:stretch>
-                  </pic:blipFill>
-                  <pic:spPr>
-                    <a:xfrm>
-                      <a:off x="0" y="0"/>
-                      <a:ext cx="5120640" cy="4493959"/>
-                    </a:xfrm>
-                    <a:prstGeom prst="rect">
-                      <a:avLst/>
-                    </a:prstGeom>
-                  </pic:spPr>
-                </pic:pic>
-              </a:graphicData>
-            </a:graphic>
-          </wp:inline>
-        </w:drawing>
-      </w:r>
-    </w:p>
-    <w:p>
-      <w:pPr>
-        <w:jc w:val="center"/>
-        <w:spacing w:before="0" w:after="160"/>
-      </w:pPr>
-      <w:r>
-        <w:rPr>
-          <w:b/>
-          <w:i/>
-          <w:sz w:val="20"/>
-          <w:szCs w:val="20"/>
-        </w:rPr>
-        <w:t xml:space="preserve">Figure 10.</w:t>
-      </w:r>
-      <w:r>
-        <w:rPr>
-          <w:i/>
-          <w:sz w:val="20"/>
-          <w:szCs w:val="20"/>
-        </w:rPr>
-        <w:t xml:space="preserve"> t-SNE of real versus synthetic feature vectors (Wednesday model).</w:t>
-      </w:r>
-    </w:p>
-    <w:p>
-      <w:pPr>
-        <w:spacing w:before="0" w:after="140"/>
-      </w:pPr>
-      <w:r>
-        <w:rPr>
-          <w:sz w:val="22"/>
-          <w:szCs w:val="22"/>
-        </w:rPr>
-        <w:t xml:space="preserve">Figure 10 gives the non-linear view (van der Maaten and Hinton, 2008), better at exposing local structure. Synthetic points overlap the real manifold across most regions but thin out in some pockets, matching the alignment gaps: the mean absolute per-feature difference is </w:t>
-      </w:r>
-      <w:r>
-        <w:rPr>
-          <w:b/>
-          <w:sz w:val="22"/>
-          <w:szCs w:val="22"/>
-        </w:rPr>
-        <w:t xml:space="preserve">0.4583</w:t>
-      </w:r>
-      <w:r>
-        <w:rPr>
-          <w:sz w:val="22"/>
-          <w:szCs w:val="22"/>
-        </w:rPr>
-        <w:t xml:space="preserve"> for means and </w:t>
-      </w:r>
-      <w:r>
-        <w:rPr>
-          <w:b/>
-          <w:sz w:val="22"/>
-          <w:szCs w:val="22"/>
-        </w:rPr>
-        <w:t xml:space="preserve">0.5373</w:t>
-      </w:r>
-      <w:r>
-        <w:rPr>
-          <w:sz w:val="22"/>
-          <w:szCs w:val="22"/>
-        </w:rPr>
-        <w:t xml:space="preserve"> for standard deviations. This is a moderate match — the generator captures the general shape but under-represents the spread of heavy-tailed or near-binary features (byte/packet counts, flag columns), the known hard case for tabular GANs.</w:t>
-      </w:r>
-    </w:p>
-    <w:p>
-      <w:pPr>
-        <w:spacing w:before="0" w:after="140"/>
-      </w:pPr>
-      <w:r>
-        <w:rPr>
-          <w:b/>
-          <w:sz w:val="22"/>
-          <w:szCs w:val="22"/>
-        </w:rPr>
-        <w:t xml:space="preserve">Extension — full multi-day dataset.</w:t>
-      </w:r>
-      <w:r>
-        <w:rPr>
-          <w:sz w:val="22"/>
-          <w:szCs w:val="22"/>
-        </w:rPr>
-        <w:t xml:space="preserve"> Retraining on a 30,000-row sample spanning all days tests whether one unconditional generator can cover many attack families.</w:t>
-      </w:r>
-    </w:p>
-    <w:p>
-      <w:pPr>
-        <w:jc w:val="center"/>
-        <w:spacing w:before="120" w:after="40"/>
-      </w:pPr>
-      <w:r>
-        <w:drawing>
-          <wp:inline distT="0" distB="0" distL="0" distR="0">
-            <wp:extent cx="5120640" cy="3998207"/>
-            <wp:docPr id="11" name="image11.png"/>
-            <a:graphic xmlns:a="http://schemas.openxmlformats.org/drawingml/2006/main">
-              <a:graphicData uri="http://schemas.openxmlformats.org/drawingml/2006/picture">
-                <pic:pic xmlns:pic="http://schemas.openxmlformats.org/drawingml/2006/picture">
-                  <pic:nvPicPr>
-                    <pic:cNvPr id="11" name="image11.png"/>
-                    <pic:cNvPicPr/>
-                  </pic:nvPicPr>
-                  <pic:blipFill>
-                    <a:blip r:embed="rId110"/>
                     <a:stretch>
                       <a:fillRect/>
                     </a:stretch>
@@ -1115,7 +1041,7 @@
           <w:sz w:val="20"/>
           <w:szCs w:val="20"/>
         </w:rPr>
-        <w:t xml:space="preserve">Figure 11.</w:t>
+        <w:t xml:space="preserve">Figure 10.</w:t>
       </w:r>
       <w:r>
         <w:rPr>
@@ -1135,7 +1061,7 @@
           <w:sz w:val="22"/>
           <w:szCs w:val="22"/>
         </w:rPr>
-        <w:t xml:space="preserve">Figure 11 shows the real data now spans many families and the synthetic points concentrate where the mass is. The gaps worsen slightly (mean </w:t>
+        <w:t xml:space="preserve">Figure 10 shows the real data now spans many families and the synthetic points concentrate where the mass is. The gaps worsen slightly (mean </w:t>
       </w:r>
       <w:r>
         <w:rPr>
@@ -1202,16 +1128,16 @@
         <w:drawing>
           <wp:inline distT="0" distB="0" distL="0" distR="0">
             <wp:extent cx="5120640" cy="2247691"/>
-            <wp:docPr id="12" name="image12.png"/>
+            <wp:docPr id="11" name="image11.png"/>
             <a:graphic xmlns:a="http://schemas.openxmlformats.org/drawingml/2006/main">
               <a:graphicData uri="http://schemas.openxmlformats.org/drawingml/2006/picture">
                 <pic:pic xmlns:pic="http://schemas.openxmlformats.org/drawingml/2006/picture">
                   <pic:nvPicPr>
-                    <pic:cNvPr id="12" name="image12.png"/>
+                    <pic:cNvPr id="11" name="image11.png"/>
                     <pic:cNvPicPr/>
                   </pic:nvPicPr>
                   <pic:blipFill>
-                    <a:blip r:embed="rId111"/>
+                    <a:blip r:embed="rId110"/>
                     <a:stretch>
                       <a:fillRect/>
                     </a:stretch>
@@ -1244,7 +1170,7 @@
           <w:sz w:val="20"/>
           <w:szCs w:val="20"/>
         </w:rPr>
-        <w:t xml:space="preserve">Figure 12.</w:t>
+        <w:t xml:space="preserve">Figure 11.</w:t>
       </w:r>
       <w:r>
         <w:rPr>
@@ -1264,7 +1190,7 @@
           <w:sz w:val="22"/>
           <w:szCs w:val="22"/>
         </w:rPr>
-        <w:t xml:space="preserve">Figure 12 shows the generated cakes are recognisable — a cake-body silhouette with candle-like marks appears consistently across the batch — and training stayed stable across 45 epochs (final D ≈ 0.416 / G ≈ 4.214) without diverging. The FID is </w:t>
+        <w:t xml:space="preserve">Figure 11 shows the generated cakes are recognisable — a cake-body silhouette with candle-like marks appears consistently across the batch — and training stayed stable across 45 epochs (final D ≈ 0.416 / G ≈ 4.214) without diverging. The FID is </w:t>
       </w:r>
       <w:r>
         <w:rPr>
@@ -1311,16 +1237,16 @@
         <w:drawing>
           <wp:inline distT="0" distB="0" distL="0" distR="0">
             <wp:extent cx="5120640" cy="2217022"/>
-            <wp:docPr id="13" name="image13.png"/>
+            <wp:docPr id="12" name="image12.png"/>
             <a:graphic xmlns:a="http://schemas.openxmlformats.org/drawingml/2006/main">
               <a:graphicData uri="http://schemas.openxmlformats.org/drawingml/2006/picture">
                 <pic:pic xmlns:pic="http://schemas.openxmlformats.org/drawingml/2006/picture">
                   <pic:nvPicPr>
-                    <pic:cNvPr id="13" name="image13.png"/>
+                    <pic:cNvPr id="12" name="image12.png"/>
                     <pic:cNvPicPr/>
                   </pic:nvPicPr>
                   <pic:blipFill>
-                    <a:blip r:embed="rId112"/>
+                    <a:blip r:embed="rId111"/>
                     <a:stretch>
                       <a:fillRect/>
                     </a:stretch>
@@ -1353,7 +1279,7 @@
           <w:sz w:val="20"/>
           <w:szCs w:val="20"/>
         </w:rPr>
-        <w:t xml:space="preserve">Figure 13.</w:t>
+        <w:t xml:space="preserve">Figure 12.</w:t>
       </w:r>
       <w:r>
         <w:rPr>
@@ -1373,7 +1299,7 @@
           <w:sz w:val="22"/>
           <w:szCs w:val="22"/>
         </w:rPr>
-        <w:t xml:space="preserve">Figure 13 reveals a clean relationship: the ink-density order house (0.1721) &lt; cake (0.1967) &lt; cat (0.1986) matches the FID order house (</w:t>
+        <w:t xml:space="preserve">Figure 12 reveals a clean relationship: the ink-density order house (0.1721) &lt; cake (0.1967) &lt; cat (0.1986) matches the FID order house (</w:t>
       </w:r>
       <w:r>
         <w:rPr>

</xml_diff>